<commit_message>
vault backup: 2026-09-13 21:39:14
</commit_message>
<xml_diff>
--- a/釈義/ヤドキング覚書.docx
+++ b/釈義/ヤドキング覚書.docx
@@ -35,15 +35,99 @@
           <w:ilvl w:val="0"/>
           <w:numId w:val="11"/>
         </w:numPr>
-        <w:rPr>
-          <w:rFonts w:hint="eastAsia"/>
-        </w:rPr>
       </w:pPr>
       <w:r>
         <w:rPr>
           <w:rFonts w:hint="eastAsia"/>
         </w:rPr>
         <w:t>ルカリオは超弱点。弱点を考慮すれば、コノヨザルを使わなくても落とせる。</w:t>
+      </w:r>
+    </w:p>
+    <w:p>
+      <w:pPr>
+        <w:pStyle w:val="a8"/>
+        <w:numPr>
+          <w:ilvl w:val="0"/>
+          <w:numId w:val="11"/>
+        </w:numPr>
+      </w:pPr>
+      <w:r>
+        <w:rPr>
+          <w:rFonts w:hint="eastAsia"/>
+        </w:rPr>
+        <w:t>選考において、一ターン目にニャースでサポートを</w:t>
+      </w:r>
+      <w:r>
+        <w:rPr>
+          <w:rFonts w:hint="eastAsia"/>
+        </w:rPr>
+        <w:t>使わない。</w:t>
+      </w:r>
+    </w:p>
+    <w:p>
+      <w:pPr>
+        <w:pStyle w:val="a8"/>
+        <w:numPr>
+          <w:ilvl w:val="0"/>
+          <w:numId w:val="11"/>
+        </w:numPr>
+      </w:pPr>
+      <w:r>
+        <w:rPr>
+          <w:rFonts w:hint="eastAsia"/>
+        </w:rPr>
+        <w:t>対ヤドキングで出遅れた時はガルーラにエネをつけるなどしておく。</w:t>
+      </w:r>
+    </w:p>
+    <w:p>
+      <w:pPr>
+        <w:pStyle w:val="a8"/>
+        <w:numPr>
+          <w:ilvl w:val="0"/>
+          <w:numId w:val="11"/>
+        </w:numPr>
+      </w:pPr>
+      <w:r>
+        <w:rPr>
+          <w:rFonts w:hint="eastAsia"/>
+        </w:rPr>
+        <w:t>シェイミが出ても</w:t>
+      </w:r>
+      <w:r>
+        <w:rPr>
+          <w:rFonts w:hint="eastAsia"/>
+        </w:rPr>
+        <w:t>EX</w:t>
+      </w:r>
+      <w:r>
+        <w:rPr>
+          <w:rFonts w:hint="eastAsia"/>
+        </w:rPr>
+        <w:t>は打てる。全然知らなかった。でも確かにそうだ。</w:t>
+      </w:r>
+    </w:p>
+    <w:p>
+      <w:pPr>
+        <w:pStyle w:val="a8"/>
+        <w:numPr>
+          <w:ilvl w:val="0"/>
+          <w:numId w:val="11"/>
+        </w:numPr>
+        <w:rPr>
+          <w:rFonts w:hint="eastAsia"/>
+        </w:rPr>
+      </w:pPr>
+      <w:r>
+        <w:rPr>
+          <w:rFonts w:hint="eastAsia"/>
+        </w:rPr>
+        <w:t>バケガクレは１１０＋アドレナブレイン</w:t>
+      </w:r>
+      <w:r>
+        <w:rPr>
+          <w:rFonts w:hint="eastAsia"/>
+        </w:rPr>
+        <w:t>が使える。</w:t>
       </w:r>
     </w:p>
     <w:p>

</xml_diff>

<commit_message>
vault backup: 2026-09-26 08:07:30
</commit_message>
<xml_diff>
--- a/釈義/ヤドキング覚書.docx
+++ b/釈義/ヤドキング覚書.docx
@@ -55,7 +55,13 @@
         <w:rPr>
           <w:rFonts w:hint="eastAsia"/>
         </w:rPr>
-        <w:t>選考において、一ターン目にニャースでサポートを</w:t>
+        <w:t>先行</w:t>
+      </w:r>
+      <w:r>
+        <w:rPr>
+          <w:rFonts w:hint="eastAsia"/>
+        </w:rPr>
+        <w:t>において、一ターン目にニャースでサポートを</w:t>
       </w:r>
       <w:r>
         <w:rPr>
@@ -113,9 +119,21 @@
           <w:ilvl w:val="0"/>
           <w:numId w:val="11"/>
         </w:numPr>
+      </w:pPr>
+      <w:r>
         <w:rPr>
           <w:rFonts w:hint="eastAsia"/>
         </w:rPr>
+        <w:t>でもテラスタルは打てないぞ。何度も間違えている。</w:t>
+      </w:r>
+    </w:p>
+    <w:p>
+      <w:pPr>
+        <w:pStyle w:val="a8"/>
+        <w:numPr>
+          <w:ilvl w:val="0"/>
+          <w:numId w:val="11"/>
+        </w:numPr>
       </w:pPr>
       <w:r>
         <w:rPr>
@@ -128,6 +146,93 @@
           <w:rFonts w:hint="eastAsia"/>
         </w:rPr>
         <w:t>が使える。</w:t>
+      </w:r>
+      <w:r>
+        <w:rPr>
+          <w:rFonts w:hint="eastAsia"/>
+        </w:rPr>
+        <w:t>→マシラないけど。</w:t>
+      </w:r>
+    </w:p>
+    <w:p>
+      <w:pPr>
+        <w:pStyle w:val="a8"/>
+        <w:numPr>
+          <w:ilvl w:val="0"/>
+          <w:numId w:val="11"/>
+        </w:numPr>
+      </w:pPr>
+      <w:r>
+        <w:rPr>
+          <w:rFonts w:hint="eastAsia"/>
+        </w:rPr>
+        <w:t>トライフロストは一発で落とせなくとも、大きめのところに撒いておくだけで、後で楽になる。</w:t>
+      </w:r>
+    </w:p>
+    <w:p>
+      <w:pPr>
+        <w:pStyle w:val="a8"/>
+        <w:ind w:left="400"/>
+        <w:rPr>
+          <w:rFonts w:hint="eastAsia"/>
+        </w:rPr>
+      </w:pPr>
+      <w:r>
+        <w:rPr>
+          <w:rFonts w:hint="eastAsia"/>
+        </w:rPr>
+        <w:t>しかし、テラスタルに気をつけろ。</w:t>
+      </w:r>
+    </w:p>
+    <w:p>
+      <w:pPr>
+        <w:pStyle w:val="a8"/>
+        <w:numPr>
+          <w:ilvl w:val="0"/>
+          <w:numId w:val="11"/>
+        </w:numPr>
+      </w:pPr>
+      <w:r>
+        <w:rPr>
+          <w:rFonts w:hint="eastAsia"/>
+        </w:rPr>
+        <w:t>ロケット団の監視塔はガルーラ使えない、ニャースも。気をつける。</w:t>
+      </w:r>
+    </w:p>
+    <w:p>
+      <w:pPr>
+        <w:pStyle w:val="a8"/>
+        <w:numPr>
+          <w:ilvl w:val="0"/>
+          <w:numId w:val="11"/>
+        </w:numPr>
+      </w:pPr>
+      <w:r>
+        <w:rPr>
+          <w:rFonts w:hint="eastAsia"/>
+        </w:rPr>
+        <w:t>キチキギスを出せ。やられたら。</w:t>
+      </w:r>
+      <w:r>
+        <w:rPr>
+          <w:rFonts w:hint="eastAsia"/>
+        </w:rPr>
+        <w:t>ハイパーとかタンカとか使う。</w:t>
+      </w:r>
+    </w:p>
+    <w:p>
+      <w:pPr>
+        <w:pStyle w:val="a8"/>
+        <w:numPr>
+          <w:ilvl w:val="0"/>
+          <w:numId w:val="11"/>
+        </w:numPr>
+      </w:pPr>
+      <w:r>
+        <w:rPr>
+          <w:rFonts w:hint="eastAsia"/>
+        </w:rPr>
+        <w:t>キチキギスにも暗号マニアは使えるぞ。</w:t>
       </w:r>
     </w:p>
     <w:p>
@@ -175,6 +280,7 @@
         <w:docPartUnique/>
       </w:docPartObj>
     </w:sdtPr>
+    <w:sdtEndPr/>
     <w:sdtContent>
       <w:p>
         <w:pPr>

</xml_diff>